<commit_message>
feat(voucher-generation): service data merging - step 02-04
- Extended ServiceData value object with optional fields for transfers
  (pickup_time, pickup_location, dropoff_location, passengers, confirmation_code)
  and tours (meeting_point, tour_time, duration, notes)
- Updated merge logic in GenerateVoucher use case to replace {{service.*}}
  placeholders with service data values
- Missing optional service fields render as empty strings
- Updated REST API adapter to accept extended service data
- Updated template fixtures with service placeholders for acceptance tests
- Acceptance tests: 4 scenarios for US-005
- Unit tests: 3 new tests (parametrized) for service data merging

Co-Authored-By: Claude <noreply@anthropic.com>

Step-ID: 02-04
</commit_message>
<xml_diff>
--- a/src/tests/fixtures/templates/airport-transfer-v2.docx
+++ b/src/tests/fixtures/templates/airport-transfer-v2.docx
@@ -35,6 +35,36 @@
     <w:p>
       <w:r>
         <w:t>Provider: {{service.provider}}</w:t>
+      </w:r>
+    </w:p>
+    <w:p>
+      <w:r>
+        <w:t>Pickup Time: {{service.pickup_time}}</w:t>
+      </w:r>
+    </w:p>
+    <w:p>
+      <w:r>
+        <w:t>Pickup Location: {{service.pickup_location}}</w:t>
+      </w:r>
+    </w:p>
+    <w:p>
+      <w:r>
+        <w:t>Dropoff Location: {{service.dropoff_location}}</w:t>
+      </w:r>
+    </w:p>
+    <w:p>
+      <w:r>
+        <w:t>Passengers: {{service.passengers}}</w:t>
+      </w:r>
+    </w:p>
+    <w:p>
+      <w:r>
+        <w:t>Confirmation Code: {{service.confirmation_code}}</w:t>
+      </w:r>
+    </w:p>
+    <w:p>
+      <w:r>
+        <w:t>Notes: {{service.notes}}</w:t>
       </w:r>
     </w:p>
     <w:p>

</xml_diff>